<commit_message>
Remove A/E red review stamp from transmittal template
Removed the red-bordered review stamp block (REVIEWED / REVISE AND
RESUBMIT / FURNISH AS CORRECTED / REJECTED) and the explanatory
caption from 01_Transmittal.docx.

Co-Authored-By: Claude Opus 4.7 (1M context) <noreply@anthropic.com>
</commit_message>
<xml_diff>
--- a/templates/01_Transmittal.docx
+++ b/templates/01_Transmittal.docx
@@ -1485,234 +1485,6 @@
         </w:tc>
       </w:tr>
     </w:tbl>
-    <w:p/>
-    <w:p/>
-    <w:tbl>
-      <w:tblPr>
-        <w:tblW w:type="auto" w:w="0"/>
-        <w:tblLayout w:type="fixed"/>
-        <w:tblLook w:firstColumn="1" w:firstRow="1" w:lastColumn="0" w:lastRow="0" w:noHBand="0" w:noVBand="1" w:val="04A0"/>
-      </w:tblPr>
-      <w:tblGrid>
-        <w:gridCol w:w="5112"/>
-        <w:gridCol w:w="5112"/>
-      </w:tblGrid>
-      <w:tr>
-        <w:tc>
-          <w:tcPr>
-            <w:tcW w:type="dxa" w:w="5040"/>
-            <w:tcBorders>
-              <w:top w:val="single" w:sz="12" w:color="C00000"/>
-              <w:left w:val="single" w:sz="12" w:color="C00000"/>
-              <w:bottom w:val="single" w:sz="12" w:color="C00000"/>
-              <w:right w:val="single" w:sz="12" w:color="C00000"/>
-            </w:tcBorders>
-          </w:tcPr>
-          <w:p>
-            <w:r/>
-            <w:r>
-              <w:rPr>
-                <w:rFonts w:ascii="Calibri" w:hAnsi="Calibri"/>
-                <w:b/>
-                <w:i w:val="0"/>
-                <w:color w:val="C00000"/>
-                <w:sz w:val="20"/>
-                <w:u w:val="none"/>
-              </w:rPr>
-              <w:t>[ ]  REVIEWED</w:t>
-            </w:r>
-          </w:p>
-        </w:tc>
-        <w:tc>
-          <w:tcPr>
-            <w:tcW w:type="dxa" w:w="5184"/>
-            <w:tcBorders>
-              <w:top w:val="single" w:sz="12" w:color="C00000"/>
-              <w:left w:val="single" w:sz="12" w:color="C00000"/>
-              <w:bottom w:val="single" w:sz="12" w:color="C00000"/>
-              <w:right w:val="single" w:sz="12" w:color="C00000"/>
-            </w:tcBorders>
-          </w:tcPr>
-          <w:p>
-            <w:r/>
-            <w:r>
-              <w:rPr>
-                <w:rFonts w:ascii="Calibri" w:hAnsi="Calibri"/>
-                <w:b/>
-                <w:i w:val="0"/>
-                <w:color w:val="C00000"/>
-                <w:sz w:val="20"/>
-                <w:u w:val="none"/>
-              </w:rPr>
-              <w:t>[ ]  REVISE AND RESUBMIT</w:t>
-            </w:r>
-          </w:p>
-        </w:tc>
-      </w:tr>
-      <w:tr>
-        <w:tc>
-          <w:tcPr>
-            <w:tcW w:type="dxa" w:w="5040"/>
-            <w:tcBorders>
-              <w:top w:val="single" w:sz="12" w:color="C00000"/>
-              <w:left w:val="single" w:sz="12" w:color="C00000"/>
-              <w:bottom w:val="single" w:sz="12" w:color="C00000"/>
-              <w:right w:val="single" w:sz="12" w:color="C00000"/>
-            </w:tcBorders>
-          </w:tcPr>
-          <w:p>
-            <w:r/>
-            <w:r>
-              <w:rPr>
-                <w:rFonts w:ascii="Calibri" w:hAnsi="Calibri"/>
-                <w:b/>
-                <w:i w:val="0"/>
-                <w:color w:val="C00000"/>
-                <w:sz w:val="20"/>
-                <w:u w:val="none"/>
-              </w:rPr>
-              <w:t>[ ]  FURNISH AS CORRECTED</w:t>
-            </w:r>
-          </w:p>
-        </w:tc>
-        <w:tc>
-          <w:tcPr>
-            <w:tcW w:type="dxa" w:w="5184"/>
-            <w:tcBorders>
-              <w:top w:val="single" w:sz="12" w:color="C00000"/>
-              <w:left w:val="single" w:sz="12" w:color="C00000"/>
-              <w:bottom w:val="single" w:sz="12" w:color="C00000"/>
-              <w:right w:val="single" w:sz="12" w:color="C00000"/>
-            </w:tcBorders>
-          </w:tcPr>
-          <w:p>
-            <w:r/>
-            <w:r>
-              <w:rPr>
-                <w:rFonts w:ascii="Calibri" w:hAnsi="Calibri"/>
-                <w:b/>
-                <w:i w:val="0"/>
-                <w:color w:val="C00000"/>
-                <w:sz w:val="20"/>
-                <w:u w:val="none"/>
-              </w:rPr>
-              <w:t>[ ]  REJECTED</w:t>
-            </w:r>
-          </w:p>
-        </w:tc>
-      </w:tr>
-      <w:tr>
-        <w:tc>
-          <w:tcPr>
-            <w:tcW w:type="dxa" w:w="5184"/>
-            <w:gridSpan w:val="2"/>
-            <w:tcBorders>
-              <w:top w:val="single" w:sz="12" w:color="C00000"/>
-              <w:left w:val="single" w:sz="12" w:color="C00000"/>
-              <w:bottom w:val="single" w:sz="12" w:color="C00000"/>
-              <w:right w:val="single" w:sz="12" w:color="C00000"/>
-            </w:tcBorders>
-          </w:tcPr>
-          <w:p>
-            <w:r/>
-            <w:r>
-              <w:rPr>
-                <w:rFonts w:ascii="Calibri" w:hAnsi="Calibri"/>
-                <w:b w:val="0"/>
-                <w:i w:val="0"/>
-                <w:color w:val="C00000"/>
-                <w:sz w:val="18"/>
-                <w:u w:val="none"/>
-              </w:rPr>
-              <w:t>Checking is only for general conformance with the design concept of the project and general compliance with the information given in the Contract Documents. Any action shown is subject to the requirements of the plans and specifications. Contractor is responsible for dimensions which shall be confirmed and correlated at the job site; fabrication processes and techniques of construction; coordination of his work with that of all other trades; and the satisfactory performance of his work.</w:t>
-            </w:r>
-          </w:p>
-        </w:tc>
-      </w:tr>
-      <w:tr>
-        <w:tc>
-          <w:tcPr>
-            <w:tcW w:type="dxa" w:w="5040"/>
-            <w:tcBorders>
-              <w:top w:val="single" w:sz="12" w:color="C00000"/>
-              <w:left w:val="single" w:sz="12" w:color="C00000"/>
-              <w:bottom w:val="single" w:sz="12" w:color="C00000"/>
-              <w:right w:val="single" w:sz="12" w:color="C00000"/>
-            </w:tcBorders>
-          </w:tcPr>
-          <w:p>
-            <w:r/>
-            <w:r>
-              <w:rPr>
-                <w:rFonts w:ascii="Calibri" w:hAnsi="Calibri"/>
-                <w:b w:val="0"/>
-                <w:i w:val="0"/>
-                <w:color w:val="C00000"/>
-                <w:sz w:val="20"/>
-                <w:u w:val="none"/>
-              </w:rPr>
-              <w:t>Date:  ______________________</w:t>
-              <w:br/>
-              <w:br/>
-              <w:t>By:    ______________________</w:t>
-            </w:r>
-          </w:p>
-        </w:tc>
-        <w:tc>
-          <w:tcPr>
-            <w:tcW w:type="dxa" w:w="5184"/>
-            <w:tcBorders>
-              <w:top w:val="single" w:sz="12" w:color="C00000"/>
-              <w:left w:val="single" w:sz="12" w:color="C00000"/>
-              <w:bottom w:val="single" w:sz="12" w:color="C00000"/>
-              <w:right w:val="single" w:sz="12" w:color="C00000"/>
-            </w:tcBorders>
-          </w:tcPr>
-          <w:p>
-            <w:pPr>
-              <w:jc w:val="right"/>
-            </w:pPr>
-            <w:r/>
-            <w:r>
-              <w:rPr>
-                <w:rFonts w:ascii="Calibri" w:hAnsi="Calibri"/>
-                <w:b w:val="0"/>
-                <w:i w:val="0"/>
-                <w:color w:val="C00000"/>
-                <w:sz w:val="16"/>
-                <w:u w:val="none"/>
-              </w:rPr>
-              <w:t>[A/E Firm Name]</w:t>
-              <w:br/>
-              <w:t>[City  -  City  -  City]</w:t>
-              <w:br/>
-              <w:t>[Phone]</w:t>
-              <w:br/>
-              <w:t>[Firm Registration No.]</w:t>
-              <w:br/>
-              <w:t>[Website]</w:t>
-            </w:r>
-          </w:p>
-        </w:tc>
-      </w:tr>
-    </w:tbl>
-    <w:p/>
-    <w:p>
-      <w:pPr>
-        <w:jc w:val="center"/>
-      </w:pPr>
-      <w:r>
-        <w:rPr>
-          <w:rFonts w:ascii="Calibri" w:hAnsi="Calibri"/>
-          <w:b w:val="0"/>
-          <w:i/>
-          <w:color w:val="000000"/>
-          <w:sz w:val="16"/>
-          <w:u w:val="none"/>
-        </w:rPr>
-        <w:t>Red review stamp area is completed by the Architect/Engineer on return - left blank by the Contractor at issue.</w:t>
-      </w:r>
-    </w:p>
     <w:sectPr>
       <w:pgSz w:w="12240" w:h="15840"/>
       <w:pgMar w:top="864" w:right="1008" w:bottom="864" w:left="1008" w:header="720" w:footer="720" w:gutter="0"/>

</xml_diff>